<commit_message>
fix(media): upgrade screenshots and video to Full HD 1080p widescreen framing
</commit_message>
<xml_diff>
--- a/Docs/laporan_kegiatan/DOCX/Buku_Manual_Pengguna_ESCM_Marmer.docx
+++ b/Docs/laporan_kegiatan/DOCX/Buku_Manual_Pengguna_ESCM_Marmer.docx
@@ -564,7 +564,7 @@
       <w:r>
         <w:drawing>
           <wp:inline xmlns:a="http://schemas.openxmlformats.org/drawingml/2006/main" xmlns:pic="http://schemas.openxmlformats.org/drawingml/2006/picture">
-            <wp:extent cx="5303520" cy="2983230"/>
+            <wp:extent cx="5486400" cy="3086100"/>
             <wp:docPr id="2" name="Picture 2"/>
             <wp:cNvGraphicFramePr>
               <a:graphicFrameLocks noChangeAspect="1"/>
@@ -585,7 +585,7 @@
                   <pic:spPr>
                     <a:xfrm>
                       <a:off x="0" y="0"/>
-                      <a:ext cx="5303520" cy="2983230"/>
+                      <a:ext cx="5486400" cy="3086100"/>
                     </a:xfrm>
                     <a:prstGeom prst="rect"/>
                   </pic:spPr>
@@ -1224,7 +1224,7 @@
       <w:r>
         <w:drawing>
           <wp:inline xmlns:a="http://schemas.openxmlformats.org/drawingml/2006/main" xmlns:pic="http://schemas.openxmlformats.org/drawingml/2006/picture">
-            <wp:extent cx="5303520" cy="2983230"/>
+            <wp:extent cx="5486400" cy="3086100"/>
             <wp:docPr id="3" name="Picture 3"/>
             <wp:cNvGraphicFramePr>
               <a:graphicFrameLocks noChangeAspect="1"/>
@@ -1245,7 +1245,7 @@
                   <pic:spPr>
                     <a:xfrm>
                       <a:off x="0" y="0"/>
-                      <a:ext cx="5303520" cy="2983230"/>
+                      <a:ext cx="5486400" cy="3086100"/>
                     </a:xfrm>
                     <a:prstGeom prst="rect"/>
                   </pic:spPr>
@@ -2200,7 +2200,7 @@
       <w:r>
         <w:drawing>
           <wp:inline xmlns:a="http://schemas.openxmlformats.org/drawingml/2006/main" xmlns:pic="http://schemas.openxmlformats.org/drawingml/2006/picture">
-            <wp:extent cx="5303520" cy="2983230"/>
+            <wp:extent cx="5486400" cy="3086100"/>
             <wp:docPr id="4" name="Picture 4"/>
             <wp:cNvGraphicFramePr>
               <a:graphicFrameLocks noChangeAspect="1"/>
@@ -2221,7 +2221,7 @@
                   <pic:spPr>
                     <a:xfrm>
                       <a:off x="0" y="0"/>
-                      <a:ext cx="5303520" cy="2983230"/>
+                      <a:ext cx="5486400" cy="3086100"/>
                     </a:xfrm>
                     <a:prstGeom prst="rect"/>
                   </pic:spPr>
@@ -3423,7 +3423,7 @@
       <w:r>
         <w:drawing>
           <wp:inline xmlns:a="http://schemas.openxmlformats.org/drawingml/2006/main" xmlns:pic="http://schemas.openxmlformats.org/drawingml/2006/picture">
-            <wp:extent cx="5303520" cy="2983230"/>
+            <wp:extent cx="5486400" cy="3086100"/>
             <wp:docPr id="5" name="Picture 5"/>
             <wp:cNvGraphicFramePr>
               <a:graphicFrameLocks noChangeAspect="1"/>
@@ -3444,7 +3444,7 @@
                   <pic:spPr>
                     <a:xfrm>
                       <a:off x="0" y="0"/>
-                      <a:ext cx="5303520" cy="2983230"/>
+                      <a:ext cx="5486400" cy="3086100"/>
                     </a:xfrm>
                     <a:prstGeom prst="rect"/>
                   </pic:spPr>
@@ -4104,7 +4104,7 @@
       <w:r>
         <w:drawing>
           <wp:inline xmlns:a="http://schemas.openxmlformats.org/drawingml/2006/main" xmlns:pic="http://schemas.openxmlformats.org/drawingml/2006/picture">
-            <wp:extent cx="5303520" cy="2983230"/>
+            <wp:extent cx="5486400" cy="3086100"/>
             <wp:docPr id="6" name="Picture 6"/>
             <wp:cNvGraphicFramePr>
               <a:graphicFrameLocks noChangeAspect="1"/>
@@ -4125,7 +4125,7 @@
                   <pic:spPr>
                     <a:xfrm>
                       <a:off x="0" y="0"/>
-                      <a:ext cx="5303520" cy="2983230"/>
+                      <a:ext cx="5486400" cy="3086100"/>
                     </a:xfrm>
                     <a:prstGeom prst="rect"/>
                   </pic:spPr>
@@ -4530,7 +4530,7 @@
       <w:r>
         <w:drawing>
           <wp:inline xmlns:a="http://schemas.openxmlformats.org/drawingml/2006/main" xmlns:pic="http://schemas.openxmlformats.org/drawingml/2006/picture">
-            <wp:extent cx="5303520" cy="2983230"/>
+            <wp:extent cx="5486400" cy="3086100"/>
             <wp:docPr id="7" name="Picture 7"/>
             <wp:cNvGraphicFramePr>
               <a:graphicFrameLocks noChangeAspect="1"/>
@@ -4551,7 +4551,7 @@
                   <pic:spPr>
                     <a:xfrm>
                       <a:off x="0" y="0"/>
-                      <a:ext cx="5303520" cy="2983230"/>
+                      <a:ext cx="5486400" cy="3086100"/>
                     </a:xfrm>
                     <a:prstGeom prst="rect"/>
                   </pic:spPr>
@@ -4713,7 +4713,7 @@
       <w:r>
         <w:drawing>
           <wp:inline xmlns:a="http://schemas.openxmlformats.org/drawingml/2006/main" xmlns:pic="http://schemas.openxmlformats.org/drawingml/2006/picture">
-            <wp:extent cx="5303520" cy="2983230"/>
+            <wp:extent cx="5486400" cy="3086100"/>
             <wp:docPr id="8" name="Picture 8"/>
             <wp:cNvGraphicFramePr>
               <a:graphicFrameLocks noChangeAspect="1"/>
@@ -4734,7 +4734,7 @@
                   <pic:spPr>
                     <a:xfrm>
                       <a:off x="0" y="0"/>
-                      <a:ext cx="5303520" cy="2983230"/>
+                      <a:ext cx="5486400" cy="3086100"/>
                     </a:xfrm>
                     <a:prstGeom prst="rect"/>
                   </pic:spPr>
@@ -5162,7 +5162,7 @@
       <w:r>
         <w:drawing>
           <wp:inline xmlns:a="http://schemas.openxmlformats.org/drawingml/2006/main" xmlns:pic="http://schemas.openxmlformats.org/drawingml/2006/picture">
-            <wp:extent cx="5303520" cy="2983230"/>
+            <wp:extent cx="5486400" cy="3086100"/>
             <wp:docPr id="9" name="Picture 9"/>
             <wp:cNvGraphicFramePr>
               <a:graphicFrameLocks noChangeAspect="1"/>
@@ -5183,7 +5183,7 @@
                   <pic:spPr>
                     <a:xfrm>
                       <a:off x="0" y="0"/>
-                      <a:ext cx="5303520" cy="2983230"/>
+                      <a:ext cx="5486400" cy="3086100"/>
                     </a:xfrm>
                     <a:prstGeom prst="rect"/>
                   </pic:spPr>
@@ -5312,7 +5312,7 @@
       <w:r>
         <w:drawing>
           <wp:inline xmlns:a="http://schemas.openxmlformats.org/drawingml/2006/main" xmlns:pic="http://schemas.openxmlformats.org/drawingml/2006/picture">
-            <wp:extent cx="5303520" cy="2983230"/>
+            <wp:extent cx="5486400" cy="3086100"/>
             <wp:docPr id="10" name="Picture 10"/>
             <wp:cNvGraphicFramePr>
               <a:graphicFrameLocks noChangeAspect="1"/>
@@ -5333,7 +5333,7 @@
                   <pic:spPr>
                     <a:xfrm>
                       <a:off x="0" y="0"/>
-                      <a:ext cx="5303520" cy="2983230"/>
+                      <a:ext cx="5486400" cy="3086100"/>
                     </a:xfrm>
                     <a:prstGeom prst="rect"/>
                   </pic:spPr>
@@ -5739,7 +5739,7 @@
       <w:r>
         <w:drawing>
           <wp:inline xmlns:a="http://schemas.openxmlformats.org/drawingml/2006/main" xmlns:pic="http://schemas.openxmlformats.org/drawingml/2006/picture">
-            <wp:extent cx="5303520" cy="2983230"/>
+            <wp:extent cx="5486400" cy="3086100"/>
             <wp:docPr id="11" name="Picture 11"/>
             <wp:cNvGraphicFramePr>
               <a:graphicFrameLocks noChangeAspect="1"/>
@@ -5760,7 +5760,7 @@
                   <pic:spPr>
                     <a:xfrm>
                       <a:off x="0" y="0"/>
-                      <a:ext cx="5303520" cy="2983230"/>
+                      <a:ext cx="5486400" cy="3086100"/>
                     </a:xfrm>
                     <a:prstGeom prst="rect"/>
                   </pic:spPr>
@@ -6505,7 +6505,7 @@
       <w:r>
         <w:drawing>
           <wp:inline xmlns:a="http://schemas.openxmlformats.org/drawingml/2006/main" xmlns:pic="http://schemas.openxmlformats.org/drawingml/2006/picture">
-            <wp:extent cx="5303520" cy="2983230"/>
+            <wp:extent cx="5486400" cy="3086100"/>
             <wp:docPr id="12" name="Picture 12"/>
             <wp:cNvGraphicFramePr>
               <a:graphicFrameLocks noChangeAspect="1"/>
@@ -6526,7 +6526,7 @@
                   <pic:spPr>
                     <a:xfrm>
                       <a:off x="0" y="0"/>
-                      <a:ext cx="5303520" cy="2983230"/>
+                      <a:ext cx="5486400" cy="3086100"/>
                     </a:xfrm>
                     <a:prstGeom prst="rect"/>
                   </pic:spPr>
@@ -6778,7 +6778,7 @@
       <w:r>
         <w:drawing>
           <wp:inline xmlns:a="http://schemas.openxmlformats.org/drawingml/2006/main" xmlns:pic="http://schemas.openxmlformats.org/drawingml/2006/picture">
-            <wp:extent cx="5303520" cy="2983230"/>
+            <wp:extent cx="5486400" cy="3086100"/>
             <wp:docPr id="13" name="Picture 13"/>
             <wp:cNvGraphicFramePr>
               <a:graphicFrameLocks noChangeAspect="1"/>
@@ -6799,7 +6799,7 @@
                   <pic:spPr>
                     <a:xfrm>
                       <a:off x="0" y="0"/>
-                      <a:ext cx="5303520" cy="2983230"/>
+                      <a:ext cx="5486400" cy="3086100"/>
                     </a:xfrm>
                     <a:prstGeom prst="rect"/>
                   </pic:spPr>
@@ -7794,7 +7794,7 @@
       <w:r>
         <w:drawing>
           <wp:inline xmlns:a="http://schemas.openxmlformats.org/drawingml/2006/main" xmlns:pic="http://schemas.openxmlformats.org/drawingml/2006/picture">
-            <wp:extent cx="5303520" cy="2983230"/>
+            <wp:extent cx="5486400" cy="3086100"/>
             <wp:docPr id="14" name="Picture 14"/>
             <wp:cNvGraphicFramePr>
               <a:graphicFrameLocks noChangeAspect="1"/>
@@ -7815,7 +7815,7 @@
                   <pic:spPr>
                     <a:xfrm>
                       <a:off x="0" y="0"/>
-                      <a:ext cx="5303520" cy="2983230"/>
+                      <a:ext cx="5486400" cy="3086100"/>
                     </a:xfrm>
                     <a:prstGeom prst="rect"/>
                   </pic:spPr>
@@ -7975,7 +7975,7 @@
       <w:r>
         <w:drawing>
           <wp:inline xmlns:a="http://schemas.openxmlformats.org/drawingml/2006/main" xmlns:pic="http://schemas.openxmlformats.org/drawingml/2006/picture">
-            <wp:extent cx="5303520" cy="2983230"/>
+            <wp:extent cx="5486400" cy="3086100"/>
             <wp:docPr id="15" name="Picture 15"/>
             <wp:cNvGraphicFramePr>
               <a:graphicFrameLocks noChangeAspect="1"/>
@@ -7996,7 +7996,7 @@
                   <pic:spPr>
                     <a:xfrm>
                       <a:off x="0" y="0"/>
-                      <a:ext cx="5303520" cy="2983230"/>
+                      <a:ext cx="5486400" cy="3086100"/>
                     </a:xfrm>
                     <a:prstGeom prst="rect"/>
                   </pic:spPr>
@@ -8300,7 +8300,7 @@
       <w:r>
         <w:drawing>
           <wp:inline xmlns:a="http://schemas.openxmlformats.org/drawingml/2006/main" xmlns:pic="http://schemas.openxmlformats.org/drawingml/2006/picture">
-            <wp:extent cx="5303520" cy="2983230"/>
+            <wp:extent cx="5486400" cy="3086100"/>
             <wp:docPr id="16" name="Picture 16"/>
             <wp:cNvGraphicFramePr>
               <a:graphicFrameLocks noChangeAspect="1"/>
@@ -8321,7 +8321,7 @@
                   <pic:spPr>
                     <a:xfrm>
                       <a:off x="0" y="0"/>
-                      <a:ext cx="5303520" cy="2983230"/>
+                      <a:ext cx="5486400" cy="3086100"/>
                     </a:xfrm>
                     <a:prstGeom prst="rect"/>
                   </pic:spPr>
@@ -8822,7 +8822,7 @@
       <w:r>
         <w:drawing>
           <wp:inline xmlns:a="http://schemas.openxmlformats.org/drawingml/2006/main" xmlns:pic="http://schemas.openxmlformats.org/drawingml/2006/picture">
-            <wp:extent cx="5303520" cy="2983230"/>
+            <wp:extent cx="5486400" cy="3086100"/>
             <wp:docPr id="17" name="Picture 17"/>
             <wp:cNvGraphicFramePr>
               <a:graphicFrameLocks noChangeAspect="1"/>
@@ -8843,7 +8843,7 @@
                   <pic:spPr>
                     <a:xfrm>
                       <a:off x="0" y="0"/>
-                      <a:ext cx="5303520" cy="2983230"/>
+                      <a:ext cx="5486400" cy="3086100"/>
                     </a:xfrm>
                     <a:prstGeom prst="rect"/>
                   </pic:spPr>
@@ -9793,7 +9793,7 @@
       <w:r>
         <w:drawing>
           <wp:inline xmlns:a="http://schemas.openxmlformats.org/drawingml/2006/main" xmlns:pic="http://schemas.openxmlformats.org/drawingml/2006/picture">
-            <wp:extent cx="5303520" cy="2983230"/>
+            <wp:extent cx="5486400" cy="3086100"/>
             <wp:docPr id="18" name="Picture 18"/>
             <wp:cNvGraphicFramePr>
               <a:graphicFrameLocks noChangeAspect="1"/>
@@ -9814,7 +9814,7 @@
                   <pic:spPr>
                     <a:xfrm>
                       <a:off x="0" y="0"/>
-                      <a:ext cx="5303520" cy="2983230"/>
+                      <a:ext cx="5486400" cy="3086100"/>
                     </a:xfrm>
                     <a:prstGeom prst="rect"/>
                   </pic:spPr>
@@ -9894,7 +9894,7 @@
       <w:r>
         <w:drawing>
           <wp:inline xmlns:a="http://schemas.openxmlformats.org/drawingml/2006/main" xmlns:pic="http://schemas.openxmlformats.org/drawingml/2006/picture">
-            <wp:extent cx="5303520" cy="2983230"/>
+            <wp:extent cx="5486400" cy="3086100"/>
             <wp:docPr id="19" name="Picture 19"/>
             <wp:cNvGraphicFramePr>
               <a:graphicFrameLocks noChangeAspect="1"/>
@@ -9915,7 +9915,7 @@
                   <pic:spPr>
                     <a:xfrm>
                       <a:off x="0" y="0"/>
-                      <a:ext cx="5303520" cy="2983230"/>
+                      <a:ext cx="5486400" cy="3086100"/>
                     </a:xfrm>
                     <a:prstGeom prst="rect"/>
                   </pic:spPr>
@@ -10259,7 +10259,7 @@
       <w:r>
         <w:drawing>
           <wp:inline xmlns:a="http://schemas.openxmlformats.org/drawingml/2006/main" xmlns:pic="http://schemas.openxmlformats.org/drawingml/2006/picture">
-            <wp:extent cx="5303520" cy="2983230"/>
+            <wp:extent cx="5486400" cy="3086100"/>
             <wp:docPr id="20" name="Picture 20"/>
             <wp:cNvGraphicFramePr>
               <a:graphicFrameLocks noChangeAspect="1"/>
@@ -10280,7 +10280,7 @@
                   <pic:spPr>
                     <a:xfrm>
                       <a:off x="0" y="0"/>
-                      <a:ext cx="5303520" cy="2983230"/>
+                      <a:ext cx="5486400" cy="3086100"/>
                     </a:xfrm>
                     <a:prstGeom prst="rect"/>
                   </pic:spPr>
@@ -10524,7 +10524,7 @@
       <w:r>
         <w:drawing>
           <wp:inline xmlns:a="http://schemas.openxmlformats.org/drawingml/2006/main" xmlns:pic="http://schemas.openxmlformats.org/drawingml/2006/picture">
-            <wp:extent cx="5303520" cy="2983230"/>
+            <wp:extent cx="5486400" cy="3086100"/>
             <wp:docPr id="21" name="Picture 21"/>
             <wp:cNvGraphicFramePr>
               <a:graphicFrameLocks noChangeAspect="1"/>
@@ -10545,7 +10545,7 @@
                   <pic:spPr>
                     <a:xfrm>
                       <a:off x="0" y="0"/>
-                      <a:ext cx="5303520" cy="2983230"/>
+                      <a:ext cx="5486400" cy="3086100"/>
                     </a:xfrm>
                     <a:prstGeom prst="rect"/>
                   </pic:spPr>
@@ -11062,7 +11062,7 @@
       <w:r>
         <w:drawing>
           <wp:inline xmlns:a="http://schemas.openxmlformats.org/drawingml/2006/main" xmlns:pic="http://schemas.openxmlformats.org/drawingml/2006/picture">
-            <wp:extent cx="5303520" cy="2983230"/>
+            <wp:extent cx="5486400" cy="3086100"/>
             <wp:docPr id="22" name="Picture 22"/>
             <wp:cNvGraphicFramePr>
               <a:graphicFrameLocks noChangeAspect="1"/>
@@ -11083,7 +11083,7 @@
                   <pic:spPr>
                     <a:xfrm>
                       <a:off x="0" y="0"/>
-                      <a:ext cx="5303520" cy="2983230"/>
+                      <a:ext cx="5486400" cy="3086100"/>
                     </a:xfrm>
                     <a:prstGeom prst="rect"/>
                   </pic:spPr>

</xml_diff>